<commit_message>
fix(attestations): align DRT (FR + AR) fields to the official CNAS form
The DRT templates are a raster background with the printed cells/checkboxes; the
values are floating VML text boxes whose coordinates didn't match the printed
grids. Re-tuned each box (measured against the blank form, verified by Word
render): checkbox X centered in its square, date digits inside their cell grids
(ddMMyy), names on their dotted lines — for both the declaration and the honour
section, French and Arabic (RTL). ATS is unchanged (it was already correct).

Templates only; bookmarks/fill logic untouched, so CertificateDocumentTests still
fill and verify. chore(release): 1.19.0.

Co-Authored-By: Claude Opus 4.8 <noreply@anthropic.com>
</commit_message>
<xml_diff>
--- a/src/OptiPaie.Desktop/Assets/AtsDrtTemplates/DRT_Template_AR.docx
+++ b/src/OptiPaie.Desktop/Assets/AtsDrtTemplates/DRT_Template_AR.docx
@@ -32,7 +32,7 @@
           <w:noProof/>
         </w:rPr>
         <w:pict>
-          <v:shape style="position:absolute;margin-left:155pt;margin-top:211pt;width:80pt;height:18pt;z-index:99;mso-position-horizontal-relative:page;mso-position-vertical-relative:page" filled="f" stroked="f">
+          <v:shape style="position:absolute;margin-left:185pt;margin-top:213pt;width:80pt;height:18pt;z-index:99;mso-position-horizontal-relative:page;mso-position-vertical-relative:page" filled="f" stroked="f">
             <v:textbox inset="0,0,0,0" style="mso-fit-shape-to-text:t">
               <w:txbxContent>
                 <w:p>
@@ -51,7 +51,7 @@
           <w:noProof/>
         </w:rPr>
         <w:pict>
-          <v:shape style="position:absolute;margin-left:130pt;margin-top:189pt;width:95pt;height:18pt;z-index:99;mso-position-horizontal-relative:page;mso-position-vertical-relative:page" filled="f" stroked="f">
+          <v:shape style="position:absolute;margin-left:200pt;margin-top:193pt;width:95pt;height:18pt;z-index:99;mso-position-horizontal-relative:page;mso-position-vertical-relative:page" filled="f" stroked="f">
             <v:textbox inset="0,0,0,0" style="mso-fit-shape-to-text:t">
               <w:txbxContent>
                 <w:p>
@@ -108,7 +108,7 @@
           <w:noProof/>
         </w:rPr>
         <w:pict>
-          <v:shape style="position:absolute;margin-left:120pt;margin-top:233pt;width:75pt;height:18pt;z-index:99;mso-position-horizontal-relative:page;mso-position-vertical-relative:page" filled="f" stroked="f">
+          <v:shape style="position:absolute;margin-left:180pt;margin-top:229pt;width:75pt;height:18pt;z-index:99;mso-position-horizontal-relative:page;mso-position-vertical-relative:page" filled="f" stroked="f">
             <v:textbox inset="0,0,0,0" style="mso-fit-shape-to-text:t">
               <w:txbxContent>
                 <w:p>
@@ -127,7 +127,7 @@
           <w:noProof/>
         </w:rPr>
         <w:pict>
-          <v:shape style="position:absolute;margin-left:95pt;margin-top:252pt;width:75pt;height:18pt;z-index:99;mso-position-horizontal-relative:page;mso-position-vertical-relative:page" filled="f" stroked="f">
+          <v:shape style="position:absolute;margin-left:175pt;margin-top:248pt;width:75pt;height:18pt;z-index:99;mso-position-horizontal-relative:page;mso-position-vertical-relative:page" filled="f" stroked="f">
             <v:textbox inset="0,0,0,0" style="mso-fit-shape-to-text:t">
               <w:txbxContent>
                 <w:p>
@@ -146,8 +146,8 @@
           <w:noProof/>
         </w:rPr>
         <w:pict>
-          <v:shape style="position:absolute;margin-left:256pt;margin-top:266pt;width:16pt;height:18pt;z-index:99;mso-position-horizontal-relative:page;mso-position-vertical-relative:page" filled="f" stroked="f">
-            <v:textbox inset="0,0,0,0" style="mso-fit-shape-to-text:t">
+          <v:shape style="position:absolute;margin-left:252pt;margin-top:267pt;width:16pt;height:18pt;z-index:99;mso-position-horizontal-relative:page;mso-position-vertical-relative:page" filled="f" stroked="f">
+            <v:textbox inset="0,0,0,0" style="v-text-anchor:middle;mso-fit-shape-to-text:t">
               <w:txbxContent>
                 <w:p>
                   <w:bookmarkStart w:id="9007" w:name="Case1"/>
@@ -184,8 +184,8 @@
           <w:noProof/>
         </w:rPr>
         <w:pict>
-          <v:shape style="position:absolute;margin-left:256pt;margin-top:288pt;width:16pt;height:18pt;z-index:99;mso-position-horizontal-relative:page;mso-position-vertical-relative:page" filled="f" stroked="f">
-            <v:textbox inset="0,0,0,0" style="mso-fit-shape-to-text:t">
+          <v:shape style="position:absolute;margin-left:252pt;margin-top:286pt;width:16pt;height:18pt;z-index:99;mso-position-horizontal-relative:page;mso-position-vertical-relative:page" filled="f" stroked="f">
+            <v:textbox inset="0,0,0,0" style="v-text-anchor:middle;mso-fit-shape-to-text:t">
               <w:txbxContent>
                 <w:p>
                   <w:bookmarkStart w:id="9009" w:name="Case2"/>
@@ -260,7 +260,7 @@
           <w:noProof/>
         </w:rPr>
         <w:pict>
-          <v:shape style="position:absolute;margin-left:155pt;margin-top:476pt;width:80pt;height:18pt;z-index:99;mso-position-horizontal-relative:page;mso-position-vertical-relative:page" filled="f" stroked="f">
+          <v:shape style="position:absolute;margin-left:185pt;margin-top:478pt;width:80pt;height:18pt;z-index:99;mso-position-horizontal-relative:page;mso-position-vertical-relative:page" filled="f" stroked="f">
             <v:textbox inset="0,0,0,0" style="mso-fit-shape-to-text:t">
               <w:txbxContent>
                 <w:p>
@@ -279,7 +279,7 @@
           <w:noProof/>
         </w:rPr>
         <w:pict>
-          <v:shape style="position:absolute;margin-left:130pt;margin-top:454pt;width:95pt;height:18pt;z-index:99;mso-position-horizontal-relative:page;mso-position-vertical-relative:page" filled="f" stroked="f">
+          <v:shape style="position:absolute;margin-left:200pt;margin-top:458pt;width:95pt;height:18pt;z-index:99;mso-position-horizontal-relative:page;mso-position-vertical-relative:page" filled="f" stroked="f">
             <v:textbox inset="0,0,0,0" style="mso-fit-shape-to-text:t">
               <w:txbxContent>
                 <w:p>

</xml_diff>